<commit_message>
docs : added resume static file
</commit_message>
<xml_diff>
--- a/public/JulharieMaddin_Resume.docx
+++ b/public/JulharieMaddin_Resume.docx
@@ -193,13 +193,8 @@
         </w:rPr>
         <w:t xml:space="preserve">NC II Training, Computer Systems Servicing                                                                                          </w:t>
       </w:r>
-      <w:proofErr w:type="spellStart"/>
-      <w:r>
-        <w:t>Siocon</w:t>
-      </w:r>
-      <w:proofErr w:type="spellEnd"/>
-      <w:r>
-        <w:t>, Zamboanga del Norte</w:t>
+      <w:r>
+        <w:t>Siocon, Zamboanga del Norte</w:t>
       </w:r>
     </w:p>
     <w:p>
@@ -223,27 +218,14 @@
         <w:t xml:space="preserve">                                                                                                                               </w:t>
       </w:r>
       <w:r>
-        <w:t xml:space="preserve"> </w:t>
-      </w:r>
-      <w:r>
-        <w:t xml:space="preserve">                                      </w:t>
-      </w:r>
-      <w:r>
-        <w:t xml:space="preserve">  </w:t>
-      </w:r>
-      <w:r>
-        <w:rPr>
-          <w:i/>
-          <w:iCs/>
-        </w:rPr>
-        <w:t xml:space="preserve">Feb 2025 – Mar 2025   </w:t>
-      </w:r>
-      <w:r>
-        <w:rPr>
-          <w:i/>
-          <w:iCs/>
-        </w:rPr>
-        <w:t xml:space="preserve"> </w:t>
+        <w:t xml:space="preserve">                                         </w:t>
+      </w:r>
+      <w:r>
+        <w:rPr>
+          <w:i/>
+          <w:iCs/>
+        </w:rPr>
+        <w:t xml:space="preserve">Feb 2025 – Mar 2025    </w:t>
       </w:r>
     </w:p>
     <w:p>
@@ -306,13 +288,8 @@
       <w:r>
         <w:t xml:space="preserve">                                                                                                                                          </w:t>
       </w:r>
-      <w:proofErr w:type="spellStart"/>
-      <w:r>
-        <w:t>Siocon</w:t>
-      </w:r>
-      <w:proofErr w:type="spellEnd"/>
-      <w:r>
-        <w:t>, Zamboanga del Norte</w:t>
+      <w:r>
+        <w:t>Siocon, Zamboanga del Norte</w:t>
       </w:r>
     </w:p>
     <w:p>
@@ -430,10 +407,7 @@
         <w:t xml:space="preserve">                                                                                                                                                </w:t>
       </w:r>
       <w:r>
-        <w:t xml:space="preserve"> </w:t>
-      </w:r>
-      <w:r>
-        <w:t>Philippines</w:t>
+        <w:t xml:space="preserve"> Philippines</w:t>
       </w:r>
       <w:r>
         <w:t>, Zamboanga del Norte</w:t>
@@ -509,13 +483,6 @@
       <w:r>
         <w:t>Implemented JWT authentication, PayPal checkout, and Redis-backed shopping cart and rate limiting</w:t>
       </w:r>
-    </w:p>
-    <w:p>
-      <w:pPr>
-        <w:pStyle w:val="ListParagraph"/>
-        <w:spacing w:before="10" w:after="10"/>
-        <w:ind w:left="360"/>
-      </w:pPr>
     </w:p>
     <w:p>
       <w:pPr>
@@ -535,10 +502,7 @@
         <w:t xml:space="preserve">                                                                                                                                        </w:t>
       </w:r>
       <w:r>
-        <w:t xml:space="preserve"> </w:t>
-      </w:r>
-      <w:r>
-        <w:t>Philippines</w:t>
+        <w:t xml:space="preserve"> Philippines</w:t>
       </w:r>
       <w:r>
         <w:t>,</w:t>
@@ -616,13 +580,6 @@
       <w:r>
         <w:t>Built PayPal checkout with webhook-based payment confirmation and a pending payment order expiry scheduler, containerized with Docker multi-stage builds and Compose</w:t>
       </w:r>
-    </w:p>
-    <w:p>
-      <w:pPr>
-        <w:pStyle w:val="ListParagraph"/>
-        <w:spacing w:before="10" w:after="10"/>
-        <w:ind w:left="360"/>
-      </w:pPr>
     </w:p>
     <w:p>
       <w:pPr>
@@ -639,10 +596,7 @@
         <w:t>NP-Shop Web</w:t>
       </w:r>
       <w:r>
-        <w:t xml:space="preserve">                                                                                                                                        </w:t>
-      </w:r>
-      <w:r>
-        <w:t>Philippines</w:t>
+        <w:t xml:space="preserve">                                                                                                                                        Philippines</w:t>
       </w:r>
       <w:r>
         <w:t>, Zamboanga del Norte</w:t>
@@ -704,13 +658,6 @@
       <w:r>
         <w:t>Configured an Axios client with automatic JWT attachment and silent token refresh on 401 errors, plus route guards and a redirect-based PayPal checkout flow</w:t>
       </w:r>
-    </w:p>
-    <w:p>
-      <w:pPr>
-        <w:pStyle w:val="ListParagraph"/>
-        <w:spacing w:before="10" w:after="10"/>
-        <w:ind w:left="360"/>
-      </w:pPr>
     </w:p>
     <w:p>
       <w:pPr>
@@ -869,7 +816,6 @@
           <w:b/>
           <w:bCs/>
         </w:rPr>
-        <w:lastRenderedPageBreak/>
         <w:t xml:space="preserve">Interests: </w:t>
       </w:r>
       <w:r>

</xml_diff>